<commit_message>
feat(documents): add 7 docx templates with kantoor merge fields
Extend TEMPLATE_FILES with herinnering, aanmaning, tweede_sommatie,
dagvaarding. Update generator script to use kantoor.* fields in all
templates. All templates include IBAN, termijn_14_dagen, and
rente_type_label merge fields.

Co-Authored-By: Claude Opus 4.6 <noreply@anthropic.com>
</commit_message>
<xml_diff>
--- a/templates/14_dagenbrief.docx
+++ b/templates/14_dagenbrief.docx
@@ -12,7 +12,7 @@
           <w:b/>
           <w:sz w:val="22"/>
         </w:rPr>
-        <w:t>{{ client.naam }}</w:t>
+        <w:t>{{ kantoor.naam }}</w:t>
       </w:r>
     </w:p>
     <w:p>
@@ -25,7 +25,7 @@
           <w:b w:val="0"/>
           <w:sz w:val="22"/>
         </w:rPr>
-        <w:t>{{ client.adres }}</w:t>
+        <w:t>{{ kantoor.adres }}</w:t>
       </w:r>
     </w:p>
     <w:p>
@@ -38,7 +38,20 @@
           <w:b w:val="0"/>
           <w:sz w:val="22"/>
         </w:rPr>
-        <w:t>{{ client.postcode_stad }}</w:t>
+        <w:t>{{ kantoor.postcode_stad }}</w:t>
+      </w:r>
+    </w:p>
+    <w:p>
+      <w:pPr>
+        <w:spacing w:after="80"/>
+      </w:pPr>
+      <w:r>
+        <w:rPr>
+          <w:rFonts w:ascii="Calibri" w:hAnsi="Calibri"/>
+          <w:b w:val="0"/>
+          <w:sz w:val="22"/>
+        </w:rPr>
+        <w:t>Tel: {{ kantoor.telefoon }}</w:t>
       </w:r>
     </w:p>
     <w:p>

</xml_diff>

<commit_message>
feat(templates): update 7 DOCX templates with Lisanne's signature style
All document templates now include:
- Full signature: Mevr. mr. L. Kesting, INCASSO ADVOCAAT
- Kantoor address (dynamic from merge fields)
- Schuldhulpverleningsblok (wettelijk verplicht B2C)
- Disclaimer (vertrouwelijkheid)
- Renteoverzicht: compact footer with name + address
- Dagvaarding: formal signature (mr. L. Kesting, Advocaat)

Shared helpers added: _add_signature(), _add_schuldhulp(),
_add_betaling_instructie()

Co-Authored-By: Claude Opus 4.6 (1M context) <noreply@anthropic.com>
</commit_message>
<xml_diff>
--- a/templates/14_dagenbrief.docx
+++ b/templates/14_dagenbrief.docx
@@ -762,6 +762,18 @@
           <w:b w:val="0"/>
           <w:sz w:val="22"/>
         </w:rPr>
+      </w:r>
+    </w:p>
+    <w:p>
+      <w:pPr>
+        <w:spacing w:after="80"/>
+      </w:pPr>
+      <w:r>
+        <w:rPr>
+          <w:rFonts w:ascii="Calibri" w:hAnsi="Calibri"/>
+          <w:b w:val="0"/>
+          <w:sz w:val="22"/>
+        </w:rPr>
         <w:t>Hoogachtend,</w:t>
       </w:r>
     </w:p>
@@ -784,10 +796,24 @@
       <w:r>
         <w:rPr>
           <w:rFonts w:ascii="Calibri" w:hAnsi="Calibri"/>
-          <w:b w:val="0"/>
+          <w:b/>
           <w:sz w:val="22"/>
         </w:rPr>
-        <w:t>________________________</w:t>
+        <w:t>Mevr. mr. L. Kesting</w:t>
+      </w:r>
+    </w:p>
+    <w:p>
+      <w:pPr>
+        <w:spacing w:after="80"/>
+      </w:pPr>
+      <w:r>
+        <w:rPr>
+          <w:rFonts w:ascii="Calibri" w:hAnsi="Calibri"/>
+          <w:b w:val="0"/>
+          <w:color w:val="666666"/>
+          <w:sz w:val="18"/>
+        </w:rPr>
+        <w:t>INCASSO ADVOCAAT | DEBT COLLECTION ATTORNEY</w:t>
       </w:r>
     </w:p>
     <w:p>
@@ -800,7 +826,58 @@
           <w:b w:val="0"/>
           <w:sz w:val="22"/>
         </w:rPr>
-        <w:t>Namens {{ client.naam }}</w:t>
+      </w:r>
+    </w:p>
+    <w:p>
+      <w:pPr>
+        <w:spacing w:after="80"/>
+      </w:pPr>
+      <w:r>
+        <w:rPr>
+          <w:rFonts w:ascii="Calibri" w:hAnsi="Calibri"/>
+          <w:b w:val="0"/>
+          <w:sz w:val="18"/>
+        </w:rPr>
+        <w:t>{{ kantoor.adres }}</w:t>
+      </w:r>
+    </w:p>
+    <w:p>
+      <w:pPr>
+        <w:spacing w:after="80"/>
+      </w:pPr>
+      <w:r>
+        <w:rPr>
+          <w:rFonts w:ascii="Calibri" w:hAnsi="Calibri"/>
+          <w:b w:val="0"/>
+          <w:sz w:val="18"/>
+        </w:rPr>
+        <w:t>{{ kantoor.postcode_stad }}</w:t>
+      </w:r>
+    </w:p>
+    <w:p>
+      <w:pPr>
+        <w:spacing w:after="80"/>
+      </w:pPr>
+      <w:r>
+        <w:rPr>
+          <w:rFonts w:ascii="Calibri" w:hAnsi="Calibri"/>
+          <w:b w:val="0"/>
+          <w:sz w:val="18"/>
+        </w:rPr>
+        <w:t>E: {{ kantoor.email }}</w:t>
+      </w:r>
+    </w:p>
+    <w:p>
+      <w:pPr>
+        <w:spacing w:after="80"/>
+      </w:pPr>
+      <w:r>
+        <w:rPr>
+          <w:rFonts w:ascii="Calibri" w:hAnsi="Calibri"/>
+          <w:b w:val="0"/>
+          <w:sz w:val="18"/>
+        </w:rPr>
+        <w:t>W: www.kestinglegal.nl</w:t>
       </w:r>
     </w:p>
     <w:p>
@@ -824,9 +901,23 @@
           <w:rFonts w:ascii="Calibri" w:hAnsi="Calibri"/>
           <w:b w:val="0"/>
           <w:color w:val="888888"/>
-          <w:sz w:val="18"/>
+          <w:sz w:val="16"/>
         </w:rPr>
-        <w:t>Zaaknummer: {{ zaak.zaaknummer }} | Datum: {{ vandaag }}</w:t>
+        <w:t>Heeft u financiële zorgen en ziet u geen uitweg meer? Wij informeren u graag over uw rechten als schuldenaar: kestinglegal.nl/debiteuren. Voor schuldhulpverlening kunt u terecht bij uw gemeente. Heeft u dringend emotionele steun nodig? Bel dan gratis en anoniem met Stichting 113 Zelfmoordpreventie via 0800-0113 of kijk op www.113.nl.</w:t>
+      </w:r>
+    </w:p>
+    <w:p>
+      <w:pPr>
+        <w:spacing w:after="80"/>
+      </w:pPr>
+      <w:r>
+        <w:rPr>
+          <w:rFonts w:ascii="Calibri" w:hAnsi="Calibri"/>
+          <w:b w:val="0"/>
+          <w:color w:val="AAAAAA"/>
+          <w:sz w:val="16"/>
+        </w:rPr>
+        <w:t>Disclaimer - De informatie verzonden met dit bericht is uitsluitend bestemd voor de geadresseerde(n) en kan persoonlijke of vertrouwelijke informatie bevatten, beschermd door een beroepsgeheim.</w:t>
       </w:r>
     </w:p>
     <w:sectPr>

</xml_diff>

<commit_message>
feat(templates): landregel onder wederpartij-adres op debiteurbrieven (S210)
De 5 debiteurbrieven (sommatie, tweede_sommatie, aanmaning, herinnering,
14_dagenbrief) toonden het land van de wederpartij nog niet. Voorwaardelijke
regel {%p if wederpartij.land %}{{ wederpartij.land }}{%p endif %} onder
postcode+stad: bij buitenlandse partij komt het land op een eigen regel, bij
binnenland (leeg) verdwijnt de regel volledig — brief blijft dan woord-voor-woord
gelijk aan voorheen (geverifieerd met render-test filled/empty per sjabloon).
Land zat al in de brief-context (S209). DB-her-upload via reseed_builtin_templates.

Co-Authored-By: Claude Opus 4.8 (1M context) <noreply@anthropic.com>
</commit_message>
<xml_diff>
--- a/templates/14_dagenbrief.docx
+++ b/templates/14_dagenbrief.docx
@@ -103,6 +103,45 @@
           <w:sz w:val="22"/>
         </w:rPr>
         <w:t>{{ wederpartij.postcode_stad }}</w:t>
+      </w:r>
+    </w:p>
+    <w:p>
+      <w:pPr>
+        <w:spacing w:after="80"/>
+      </w:pPr>
+      <w:r>
+        <w:rPr>
+          <w:rFonts w:ascii="Calibri" w:hAnsi="Calibri"/>
+          <w:b w:val="0"/>
+          <w:sz w:val="22"/>
+        </w:rPr>
+        <w:t>{%p if wederpartij.land %}</w:t>
+      </w:r>
+    </w:p>
+    <w:p>
+      <w:pPr>
+        <w:spacing w:after="80"/>
+      </w:pPr>
+      <w:r>
+        <w:rPr>
+          <w:rFonts w:ascii="Calibri" w:hAnsi="Calibri"/>
+          <w:b w:val="0"/>
+          <w:sz w:val="22"/>
+        </w:rPr>
+        <w:t>{{ wederpartij.land }}</w:t>
+      </w:r>
+    </w:p>
+    <w:p>
+      <w:pPr>
+        <w:spacing w:after="80"/>
+      </w:pPr>
+      <w:r>
+        <w:rPr>
+          <w:rFonts w:ascii="Calibri" w:hAnsi="Calibri"/>
+          <w:b w:val="0"/>
+          <w:sz w:val="22"/>
+        </w:rPr>
+        <w:t>{%p endif %}</w:t>
       </w:r>
     </w:p>
     <w:p>

</xml_diff>